<commit_message>
Docs: walkthrough mode, per-room seal, run options A/B, summary.docx
Co-Authored-By: Claude Opus 5.5 <noreply@anthropic.com>
</commit_message>
<xml_diff>
--- a/deliverables/summary.docx
+++ b/deliverables/summary.docx
@@ -45,7 +45,7 @@
         <w:t xml:space="preserve">Repository: </w:t>
       </w:r>
       <w:r>
-        <w:t xml:space="preserve">https://github.com/ChewEzekiel/rmithackathon-powerranger    </w:t>
+        <w:t xml:space="preserve">https://github.com/ChewEzekiel/treaty-room    </w:t>
       </w:r>
       <w:r>
         <w:rPr>
@@ -54,7 +54,7 @@
         <w:t xml:space="preserve">Demo video: </w:t>
       </w:r>
       <w:r>
-        <w:t>demo/video.mp4</w:t>
+        <w:t>demo/video.mp4 (recorded in walkthrough mode, see below)</w:t>
       </w:r>
     </w:p>
     <w:p>
@@ -104,7 +104,7 @@
     </w:p>
     <w:p>
       <w:r>
-        <w:t>Treaty Room is a sealed room for a consortium. Each member's deposit is encrypted in their own browser to the room. The host's database holds only ciphertext and metadata. The room is sealed: even depositors cannot open it. It unseals for every member at the same moment, and only when 2 of 3 institution admins co-sign a TideCloak change request: the "treaty". A rogue steward who grants himself early read access stalls at 1 of 2 approvals. Joining a room is likewise a governed change request.</w:t>
+        <w:t>Treaty Room is a sealed room for a consortium. Each member's deposit is encrypted in their own browser to the room. The host's database holds only ciphertext and metadata. The room is sealed: even depositors cannot open it. It unseals for every member at the same moment, and only when 2 of 3 institution admins co-sign one TideCloak change request: the "treaty". A rogue steward who proposes early access stalls at 1 of 2 signatures. Joining a room is likewise a governed change request.</w:t>
       </w:r>
     </w:p>
     <w:p>
@@ -179,10 +179,10 @@
         <w:rPr>
           <w:b/>
         </w:rPr>
-        <w:t>Network-enforced room policy.</w:t>
+        <w:t>Two network-enforced policies per room.</w:t>
       </w:r>
       <w:r>
-        <w:t xml:space="preserve"> Each room has a policy under Tide's built-in RelationshipAttestation:1 contract, signed once by a realm admin in their Tide enclave. It names the room's group (/rooms/&lt;id&gt;) and uses the room id as the only tag. On every encrypt and decrypt, Tide's decentralised nodes check the user's doken for group membership and the realm role _tide_encryptor (write) or _tide_decryptor (read). Plaintext never exists on our server.</w:t>
+        <w:t xml:space="preserve"> A realm admin signs both once, in their Tide enclave ("1. Sign deposit policy" and "2. Sign reading policy"), under Tide's built-in RelationshipAttestation:1 contract with the room id as the only tag. Deposit policy: subject = group /rooms/&lt;id&gt;, role _tide_encryptor. Reading policy: subject = realm role room-&lt;id&gt;-reader, role _tide_decryptor. On every encrypt and decrypt, Tide's decentralised nodes check the user's doken against the policy. Plaintext never exists on our server.</w:t>
       </w:r>
     </w:p>
     <w:p>
@@ -197,7 +197,7 @@
         <w:t>Quorum-governed seal.</w:t>
       </w:r>
       <w:r>
-        <w:t xml:space="preserve"> Members get _tide_encryptor through the room group. _tide_decryptor is the seal: it is mapped onto the group only by an IGA change request under Quorum-Enforced Governance (Tide mode). Approvals are enclave signatures from each admin's own browser, with threshold max(1, floor(0.7 x admins)), which is 2 of 3. The server-side "authorize" call is refused in multi-admin Tide mode, so the host cannot approve on anyone's behalf.</w:t>
+        <w:t xml:space="preserve"> Members get _tide_encryptor through the room group. Nobody holds room-&lt;id&gt;-reader at first. The unseal is one IGA change request ("Propose unseal: &lt;room&gt;") that maps both _tide_decryptor and room-&lt;id&gt;-reader onto the room group, under Quorum-Enforced Governance (Tide mode). Because the reader role is per room, opening one room opens no other. Approvals are enclave signatures from each admin's own browser, with threshold max(1, floor(0.7 x admins)), which is 2 of 3. The server-side "authorize" call is refused in multi-admin Tide mode, so the host cannot approve on anyone's behalf.</w:t>
       </w:r>
     </w:p>
     <w:p>
@@ -212,7 +212,7 @@
         <w:t>Visible proof.</w:t>
       </w:r>
       <w:r>
-        <w:t xml:space="preserve"> The Operator view shows everything the host or a database thief holds, and a "Try to decrypt with the stolen data" button shows the Tide network's refusal.</w:t>
+        <w:t xml:space="preserve"> The Operator view shows everything the host or a database thief holds, and "Try to decrypt with the stolen data" shows the Tide network's refusal. "Force as operator" (realm admins, only with DEMO_RED_TEAM=1) shows TideCloak refusing a master-admin approval.</w:t>
       </w:r>
     </w:p>
     <w:p>
@@ -246,7 +246,7 @@
         <w:t>Deposit.</w:t>
       </w:r>
       <w:r>
-        <w:t xml:space="preserve"> Admins from the three institutions sign in with Tide and post findings with Encrypt &amp; post. The server stores ciphertext only.</w:t>
+        <w:t xml:space="preserve"> Admins from the three institutions sign in, click "Load my synthetic example" and "Encrypt &amp; deposit". The server stores ciphertext only.</w:t>
       </w:r>
     </w:p>
     <w:p>
@@ -261,7 +261,7 @@
         <w:t>Sealed.</w:t>
       </w:r>
       <w:r>
-        <w:t xml:space="preserve"> Decrypt thread is refused by the Tide network: no one holds _tide_decryptor yet, depositors included.</w:t>
+        <w:t xml:space="preserve"> "Open" / "Open all" is refused by the Tide network: no one holds the room's reader role yet, depositors included.</w:t>
       </w:r>
     </w:p>
     <w:p>
@@ -276,7 +276,7 @@
         <w:t>Rogue steward.</w:t>
       </w:r>
       <w:r>
-        <w:t xml:space="preserve"> One admin files a change request for early read access. Governance shows it pending at 1 of 2. Force as operator tries the server-side authorise lane with the master-admin password; TideCloak refuses.</w:t>
+        <w:t xml:space="preserve"> One admin files "Propose unseal" on Governance and signs it; it waits at 1 of 2. "Force as operator" tries the server-side authorize lane with the master-admin password; TideCloak refuses.</w:t>
       </w:r>
     </w:p>
     <w:p>
@@ -291,7 +291,7 @@
         <w:t>Treaty.</w:t>
       </w:r>
       <w:r>
-        <w:t xml:space="preserve"> A second admin approves in their own Tide enclave. Quorum is reached, the change commits and _tide_decryptor is mapped onto the room group.</w:t>
+        <w:t xml:space="preserve"> A second admin signs in their own enclave. Quorum is reached and the change commits, mapping _tide_decryptor and room-&lt;id&gt;-reader onto that room's group only.</w:t>
       </w:r>
     </w:p>
     <w:p>
@@ -306,7 +306,7 @@
         <w:t>Unseal.</w:t>
       </w:r>
       <w:r>
-        <w:t xml:space="preserve"> Members sign out and in to refresh their token, and the thread decrypts for all of them at once.</w:t>
+        <w:t xml:space="preserve"> Members click "Refresh access" for a fresh token, then "Open all": the room opens for all of them.</w:t>
       </w:r>
     </w:p>
     <w:p>
@@ -322,6 +322,30 @@
       </w:r>
       <w:r>
         <w:t xml:space="preserve"> The raw database file (ciphertext, signed policies, metadata) and the network's refusal to decrypt it.</w:t>
+      </w:r>
+    </w:p>
+    <w:p>
+      <w:pPr>
+        <w:pStyle w:val="Heading1"/>
+      </w:pPr>
+      <w:r>
+        <w:t>Walkthrough mode and the demo video</w:t>
+      </w:r>
+    </w:p>
+    <w:p>
+      <w:r>
+        <w:t>On 22 October, Tide's public ORK network had nodes down (ork2, ork3 and ork7 returned HTTP 503). Creating a new Tide account needs every selected ORK, so nobody could enrol, and the live flow stops before any policy can be signed. Our live setup worked up to that step: TideCloak running, realm created and licensed, IGA enabled and the adapter config exported. The steps after enrolment could not be run against the live network that day.</w:t>
+      </w:r>
+    </w:p>
+    <w:p>
+      <w:r>
+        <w:rPr>
+          <w:b/>
+        </w:rPr>
+        <w:t xml:space="preserve">Honest disclosure: </w:t>
+      </w:r>
+      <w:r>
+        <w:t>So the screens and flows could still be shown, we added a walkthrough mode. Running NEXT_PUBLIC_WALKTHROUGH=1 npm run dev makes webpack swap the Tide SDK boundary (@tidecloak/nextjs, @tidecloak/js and lib/tide/relationship) for a simulation: persona sign-in (Dr Mei Lee, Northbridge admin; Dr Daniel Chen, Helix admin; Dr Aisha Rahman, St Aurelia admin; Dr Nurul Huda, Sunway researcher), a simulated enclave panel for co-signing with a threshold of 2 shown as the quorum, the same RelationshipAttestation checks and refusal messages, and AES-GCM as a stand-in for Tide encryption. A banner on every page discloses it. The demo video was recorded in walkthrough mode; it does not show live Tide. Live mode, the default, is unchanged and uses real TideCloak.</w:t>
       </w:r>
     </w:p>
     <w:p>
@@ -351,7 +375,34 @@
         <w:spacing w:after="40"/>
       </w:pPr>
       <w:r>
-        <w:t>Metadata (who deposited, when, and size) is visible to the host.</w:t>
+        <w:t>Walkthrough mode is a simulation with no cryptographic enforcement. It accepts unsigned persona tokens, so NEXT_PUBLIC_WALKTHROUGH must never be set in a real deployment.</w:t>
+      </w:r>
+    </w:p>
+    <w:p>
+      <w:pPr>
+        <w:pStyle w:val="ListBullet"/>
+        <w:spacing w:after="40"/>
+      </w:pPr>
+      <w:r>
+        <w:t>Live mode was verified only up to account enrolment on 22 October, because Tide's public nodes were partly down.</w:t>
+      </w:r>
+    </w:p>
+    <w:p>
+      <w:pPr>
+        <w:pStyle w:val="ListBullet"/>
+        <w:spacing w:after="40"/>
+      </w:pPr>
+      <w:r>
+        <w:t>The institution in a user's profile is self-asserted; access decisions use the signed groups and roles.</w:t>
+      </w:r>
+    </w:p>
+    <w:p>
+      <w:pPr>
+        <w:pStyle w:val="ListBullet"/>
+        <w:spacing w:after="40"/>
+      </w:pPr>
+      <w:r>
+        <w:t>Metadata (author name and institution, room, post type, time and size) is visible to the host.</w:t>
       </w:r>
     </w:p>
     <w:p>
@@ -409,7 +460,7 @@
     </w:p>
     <w:p>
       <w:r>
-        <w:t>Full steps and troubleshooting are in RUN_INSTRUCTIONS.md in the repository.</w:t>
+        <w:t>Full steps and troubleshooting are in RUN_INSTRUCTIONS.md (also supplied as a separate deliverable).</w:t>
       </w:r>
     </w:p>
     <w:p>
@@ -418,7 +469,13 @@
         <w:spacing w:after="40"/>
       </w:pPr>
       <w:r>
-        <w:t>TideCloak must run on Linux with Docker (Tide's Windows native library is a stub). We used a GitHub Codespace.</w:t>
+        <w:rPr>
+          <w:b/>
+        </w:rPr>
+        <w:t>Walkthrough mode (no Tide account):</w:t>
+      </w:r>
+      <w:r>
+        <w:t xml:space="preserve"> copy app/.env.example to app/.env, create a placeholder app/data/tidecloak.json if missing (command in RUN_INSTRUCTIONS.md), then cd app &amp;&amp; npm install &amp;&amp; NEXT_PUBLIC_WALKTHROUGH=1 npm run dev and open http://localhost:3000.</w:t>
       </w:r>
     </w:p>
     <w:p>
@@ -427,7 +484,13 @@
         <w:spacing w:after="40"/>
       </w:pPr>
       <w:r>
-        <w:t>Copy app/.env.example to app/.env and set KC_BOOTSTRAP_ADMIN_PASSWORD, TIDE_LICENSE_EMAIL and TIDE_TERMS_ACCEPTED=yes (only after reading https://tide.org/legal).</w:t>
+        <w:rPr>
+          <w:b/>
+        </w:rPr>
+        <w:t>Live mode:</w:t>
+      </w:r>
+      <w:r>
+        <w:t xml:space="preserve"> TideCloak must run on Linux with Docker (Tide's Windows native library is a stub); we used a GitHub Codespace. Set KC_BOOTSTRAP_ADMIN_PASSWORD, TIDE_LICENSE_EMAIL and TIDE_TERMS_ACCEPTED=yes in app/.env (the last only after reading https://tide.org/legal), run bash scripts/codespace-tidecloak.sh, forward ports with gh codespace ports forward 8080:8080 3000:3000, enrol the first admin from the printed invite link, then cd app &amp;&amp; npm install &amp;&amp; npm run dev.</w:t>
       </w:r>
     </w:p>
     <w:p>
@@ -436,7 +499,7 @@
         <w:spacing w:after="40"/>
       </w:pPr>
       <w:r>
-        <w:t>On the Docker host run scripts/codespace-tidecloak.sh. It starts tideorg/tidecloak-dev and runs app/scripts/init-tidecloak.sh, which creates realm "consortium" with the room groups, licenses it, enables IGA and prints an invite link to enrol the first admin in the Tide enclave.</w:t>
+        <w:t>Enrol three admins (one per institution) for a real 2-of-3 quorum; an admin signs each room's two policies once.</w:t>
       </w:r>
     </w:p>
     <w:p>
@@ -445,25 +508,7 @@
         <w:spacing w:after="40"/>
       </w:pPr>
       <w:r>
-        <w:t>Forward ports from the Codespace: gh codespace ports forward 8080:8080 3000:3000.</w:t>
-      </w:r>
-    </w:p>
-    <w:p>
-      <w:pPr>
-        <w:pStyle w:val="ListBullet"/>
-        <w:spacing w:after="40"/>
-      </w:pPr>
-      <w:r>
-        <w:t>cd app &amp;&amp; npm install &amp;&amp; npm run dev, then open http://localhost:3000. If registry.npmjs.org fails TLS, use npm install --registry=https://registry.yarnpkg.com.</w:t>
-      </w:r>
-    </w:p>
-    <w:p>
-      <w:pPr>
-        <w:pStyle w:val="ListBullet"/>
-        <w:spacing w:after="40"/>
-      </w:pPr>
-      <w:r>
-        <w:t>Enrol three admins (one per institution) for a real 2-of-3 quorum; the first admin seals each room with Seal room policy.</w:t>
+        <w:t>Our venue network intercepted TLS, so npm used --registry=https://registry.yarnpkg.com.</w:t>
       </w:r>
     </w:p>
     <w:p>
@@ -475,7 +520,7 @@
           <w:i/>
           <w:sz w:val="18"/>
         </w:rPr>
-        <w:t>Built on Tide's nextjs-e2ee-vault template. All institutions, people and results are synthetic.</w:t>
+        <w:t>Built on Tide's nextjs-e2ee-vault template. Interface: Geist, zinc with an emerald accent, light and dark themes, Phosphor icons. All institutions, people and results are synthetic.</w:t>
       </w:r>
     </w:p>
     <w:sectPr>

</xml_diff>

<commit_message>
Docs and UI for the Tide-only app; user guide; live login evidence
- README, RUN_INSTRUCTIONS, summary.docx describe the real Tide-only app; the demo video's
  walkthrough recording is explained and reproducible from branch walkthrough-demo
- docs/USER_GUIDE.md: every screen and button, labels verified against the source
- docs/evidence: Tide sign-in hand-off screenshots, URL chain, API 401 matrix
- quorum wording no longer hard-codes 2 of 3; admin check pinned to realm-management;
  unused unauthenticated /api/config removed

Co-Authored-By: Claude Opus 5.5 <noreply@anthropic.com>
</commit_message>
<xml_diff>
--- a/deliverables/summary.docx
+++ b/deliverables/summary.docx
@@ -54,7 +54,7 @@
         <w:t xml:space="preserve">Demo video: </w:t>
       </w:r>
       <w:r>
-        <w:t>demo/video.mp4 (recorded in walkthrough mode, see below)</w:t>
+        <w:t>demo/video.mp4 (recorded from branch walkthrough-demo with simulated Tide calls, see below)</w:t>
       </w:r>
     </w:p>
     <w:p>
@@ -231,7 +231,7 @@
         <w:pStyle w:val="Heading1"/>
       </w:pPr>
       <w:r>
-        <w:t>Demo walkthrough</w:t>
+        <w:t>Demo flow</w:t>
       </w:r>
     </w:p>
     <w:p>
@@ -329,12 +329,18 @@
         <w:pStyle w:val="Heading1"/>
       </w:pPr>
       <w:r>
-        <w:t>Walkthrough mode and the demo video</w:t>
+        <w:t>Tide login and the demo video</w:t>
       </w:r>
     </w:p>
     <w:p>
       <w:r>
-        <w:t>On 22 October, Tide's public ORK network had nodes down (ork2, ork3 and ork7 returned HTTP 503). Creating a new Tide account needs every selected ORK, so nobody could enrol, and the live flow stops before any policy can be signed. Our live setup worked up to that step: TideCloak running, realm created and licensed, IGA enabled and the adapter config exported. The steps after enrolment could not be run against the live network that day.</w:t>
+        <w:rPr>
+          <w:b/>
+        </w:rPr>
+        <w:t xml:space="preserve">Main is Tide only. </w:t>
+      </w:r>
+      <w:r>
+        <w:t>The app on main requires Tide login. There is no simulated sign-in, enclave or encryption: users sign in through TideCloak with a Tide account, admins sign policies and change requests in their own Tide enclave, and every encrypt and decrypt is checked by Tide's ORK nodes.</w:t>
       </w:r>
     </w:p>
     <w:p>
@@ -345,7 +351,18 @@
         <w:t xml:space="preserve">Honest disclosure: </w:t>
       </w:r>
       <w:r>
-        <w:t>So the screens and flows could still be shown, we added a walkthrough mode. Running NEXT_PUBLIC_WALKTHROUGH=1 npm run dev makes webpack swap the Tide SDK boundary (@tidecloak/nextjs, @tidecloak/js and lib/tide/relationship) for a simulation: persona sign-in (Dr Mei Lee, Northbridge admin; Dr Daniel Chen, Helix admin; Dr Aisha Rahman, St Aurelia admin; Dr Nurul Huda, Sunway researcher), a simulated enclave panel for co-signing with a threshold of 2 shown as the quorum, the same RelationshipAttestation checks and refusal messages, and AES-GCM as a stand-in for Tide encryption. A banner on every page discloses it. The demo video was recorded in walkthrough mode; it does not show live Tide. Live mode, the default, is unchanged and uses real TideCloak.</w:t>
+        <w:t>On 22 October, Tide's public ORK network had nodes down (ork2, ork3 and ork7 returned HTTP 503), and creating a new Tide account needs every selected ORK. After ork2 recovered, new accounts were refused by the free-tier cap (TIDE-ORK-VOUCHER-SUBSCRIPTION_EXCEEDED_CONCURRENT), so nobody could enrol or complete a login. To still show the screens and flows, the demo video was recorded from a separate branch, walkthrough-demo, where the Tide SDK calls (sign-in, enclave co-signing, encryption) are simulated with synthetic personas and a banner on every page says so. The video does not show live Tide, and the simulation is not part of main.</w:t>
+      </w:r>
+    </w:p>
+    <w:p>
+      <w:r>
+        <w:rPr>
+          <w:b/>
+        </w:rPr>
+        <w:t xml:space="preserve">What ran live: </w:t>
+      </w:r>
+      <w:r>
+        <w:t>TideCloak on the official image in a GitHub Codespace; realm consortium licensed with a Tide vendor key; IGA in Tide mode, so governed admin writes are answered with HTTP 202 change requests (266 approved, including the two per-room reader roles); and the Tide adapter config exported for the app. The read-back realm state, logs and outage timeline are in docs/evidence/live-tidecloak.md.</w:t>
       </w:r>
     </w:p>
     <w:p>
@@ -375,7 +392,7 @@
         <w:spacing w:after="40"/>
       </w:pPr>
       <w:r>
-        <w:t>Walkthrough mode is a simulation with no cryptographic enforcement. It accepts unsigned persona tokens, so NEXT_PUBLIC_WALKTHROUGH must never be set in a real deployment.</w:t>
+        <w:t>No Tide account could be created on 22 October, so Tide login, enclave signing of the room policies and RelationshipAttestation:1 encrypt and decrypt were not run live. The video shows them simulated.</w:t>
       </w:r>
     </w:p>
     <w:p>
@@ -384,7 +401,16 @@
         <w:spacing w:after="40"/>
       </w:pPr>
       <w:r>
-        <w:t>Live mode was verified only up to account enrolment on 22 October, because Tide's public nodes were partly down.</w:t>
+        <w:t>Main has no fallback: using the app needs an enrolled Tide account.</w:t>
+      </w:r>
+    </w:p>
+    <w:p>
+      <w:pPr>
+        <w:pStyle w:val="ListBullet"/>
+        <w:spacing w:after="40"/>
+      </w:pPr>
+      <w:r>
+        <w:t>Branch walkthrough-demo is a recording build with no cryptographic enforcement; it must never be deployed.</w:t>
       </w:r>
     </w:p>
     <w:p>
@@ -472,10 +498,10 @@
         <w:rPr>
           <w:b/>
         </w:rPr>
-        <w:t>Walkthrough mode (no Tide account):</w:t>
+        <w:t>TideCloak:</w:t>
       </w:r>
       <w:r>
-        <w:t xml:space="preserve"> copy app/.env.example to app/.env, create a placeholder app/data/tidecloak.json if missing (command in RUN_INSTRUCTIONS.md), then cd app &amp;&amp; npm install &amp;&amp; NEXT_PUBLIC_WALKTHROUGH=1 npm run dev and open http://localhost:3000.</w:t>
+        <w:t xml:space="preserve"> it must run on Linux with Docker (Tide's Windows native library is a stub); we used a GitHub Codespace. Copy app/.env.example to app/.env and set KC_BOOTSTRAP_ADMIN_PASSWORD, TIDE_LICENSE_EMAIL and TIDE_TERMS_ACCEPTED=yes (the last only after reading https://tide.org/legal), run bash scripts/codespace-tidecloak.sh and forward ports with gh codespace ports forward 8080:8080 3000:3000.</w:t>
       </w:r>
     </w:p>
     <w:p>
@@ -487,10 +513,10 @@
         <w:rPr>
           <w:b/>
         </w:rPr>
-        <w:t>Live mode:</w:t>
+        <w:t>App:</w:t>
       </w:r>
       <w:r>
-        <w:t xml:space="preserve"> TideCloak must run on Linux with Docker (Tide's Windows native library is a stub); we used a GitHub Codespace. Set KC_BOOTSTRAP_ADMIN_PASSWORD, TIDE_LICENSE_EMAIL and TIDE_TERMS_ACCEPTED=yes in app/.env (the last only after reading https://tide.org/legal), run bash scripts/codespace-tidecloak.sh, forward ports with gh codespace ports forward 8080:8080 3000:3000, enrol the first admin from the printed invite link, then cd app &amp;&amp; npm install &amp;&amp; npm run dev.</w:t>
+        <w:t xml:space="preserve"> enrol the first admin from the printed invite link, then cd app &amp;&amp; npm install &amp;&amp; npm run dev and open http://localhost:3000. Sign-in always goes through Tide.</w:t>
       </w:r>
     </w:p>
     <w:p>
@@ -508,7 +534,7 @@
         <w:spacing w:after="40"/>
       </w:pPr>
       <w:r>
-        <w:t>Our venue network intercepted TLS, so npm used --registry=https://registry.yarnpkg.com.</w:t>
+        <w:t>Our venue network intercepted TLS, so npm used --registry=https://registry.yarnpkg.com and the browser reached Tide through a SOCKS proxy via the Codespace.</w:t>
       </w:r>
     </w:p>
     <w:p>

</xml_diff>